<commit_message>
Kiem chung nguon goc du lieu: chung minh du lieu SEC la THAT, khong bia
- them scripts/verify_provenance.py + tests/test_verify_provenance.py (6 test): bam SHA-256 20 file companyfacts, tra nguoc tung fact (tag/ky/accn/form) trong snapshot SEC tho, kiem quy doi VND theo dung method (ke ca current_ytd_minus_previous_ytd), bat loi 'dien so cho du'

- ket qua: 20/20 hash khop, 4609/4609 o tra nguoc duoc trong SEC, 0 loi quy doi, 0 o bia so (703 o thieu o SEC deu la null) => reports/results/provenance.{json,md}

- audit_data: them nhom kiem tra 'provenance' (phai DAT); 98192 phep kiem tra, 0 phat hien

- run_all: them buoc provenance (21 buoc); make_report: muc 1 neu bang chung nguon goc + Phu luc B/C; docs cap nhat so test 220, so phep kiem 98192

- lam ro gioi han con lai: nhan goc 'duoc giu nguyen' tu pipeline prepare_sec (chua port) nen KHONG tai tao duoc tu SEC - da co bo nhan quy tac tai lap o data/prepared-rule + do khop 74,4%
</commit_message>
<xml_diff>
--- a/docs/BAO-CAO.docx
+++ b/docs/BAO-CAO.docx
@@ -191,6 +191,14 @@
       </w:pPr>
       <w:r>
         <w:t>Nhãn gần như là thuộc tính của công ty: HD, LOW, WMT có 100% nhãn = 1 trong mọi quý; mức khớp của nhãn với quy tắc kế toán đơn giản nhất chỉ 39%–65%.</w:t>
+      </w:r>
+    </w:p>
+    <w:p>
+      <w:pPr>
+        <w:pStyle w:val="ListBullet"/>
+      </w:pPr>
+      <w:r>
+        <w:t>Nguồn dữ liệu kiểm chứng được (không sinh/sửa tay): 20 file companyfacts của SEC đã được băm SHA-256 và khớp registry data/sec/downloads.json (0 lệch); 4.609 ô (quý × chỉ tiêu) tra ngược được trong companyfacts (kèm accn, form, ngày nộp) — 0 fact thiếu, 0 ô bịa số; 703 ô không có fact ở SEC được để null. Chi tiết: reports/results/provenance.md.</w:t>
       </w:r>
     </w:p>
     <w:p>
@@ -24564,6 +24572,28 @@
           </w:tcPr>
           <w:p>
             <w:r>
+              <w:t>reports/results/provenance.{json,md}</w:t>
+            </w:r>
+          </w:p>
+        </w:tc>
+        <w:tc>
+          <w:tcPr>
+            <w:tcW w:type="dxa" w:w="4320"/>
+          </w:tcPr>
+          <w:p>
+            <w:r>
+              <w:t>Kiểm chứng nguồn gốc: SHA-256 20 file SEC + tra ngược từng fact trong companyfacts + kiểm quy đổi VND (0 lệch, 0 fact thiếu, 0 ô bịa số)</w:t>
+            </w:r>
+          </w:p>
+        </w:tc>
+      </w:tr>
+      <w:tr>
+        <w:tc>
+          <w:tcPr>
+            <w:tcW w:type="dxa" w:w="4320"/>
+          </w:tcPr>
+          <w:p>
+            <w:r>
               <w:t>reports/figures/eda/*.png</w:t>
             </w:r>
           </w:p>
@@ -25260,6 +25290,28 @@
           <w:p>
             <w:r>
               <w:t>Demo: dự đoán MỘT quý/mẫu mới + ngưỡng vận hành + SHAP</w:t>
+            </w:r>
+          </w:p>
+        </w:tc>
+      </w:tr>
+      <w:tr>
+        <w:tc>
+          <w:tcPr>
+            <w:tcW w:type="dxa" w:w="4320"/>
+          </w:tcPr>
+          <w:p>
+            <w:r>
+              <w:t>scripts/verify_provenance.py</w:t>
+            </w:r>
+          </w:p>
+        </w:tc>
+        <w:tc>
+          <w:tcPr>
+            <w:tcW w:type="dxa" w:w="4320"/>
+          </w:tcPr>
+          <w:p>
+            <w:r>
+              <w:t>Kiểm chứng dữ liệu THẬT từ snapshot SEC (hash, fact, quy đổi VND)</w:t>
             </w:r>
           </w:p>
         </w:tc>

</xml_diff>

<commit_message>
Xuat bao cao hoan chinh + ban Word de lam slide: export_office them 2 file .docx
scripts/export_office.py: them ban WORD cho (a) dan slide bao ve -> docs/BAO-CAO-slide-bao-ve.docx va (b) bo tai lieu bao ve -> docs/bo-tai-lieu-bao-ve.docx; cap nhat docstring + print. Danh muc file xuat duoc cap nhat o README.md, docs/README.md, checklist, docs/bo-tai-lieu-bao-ve.md va Phu luc B/huong dan tai lap cua bao cao.

Ket qua xuat (python -m scripts.export_office): BAO-CAO.docx 64 tieu de/51 bang/28 hinh (BAO CAO HOAN CHINH); BAO-CAO-slide.pptx 14 slide; BAO-CAO-slide-bao-ve.pptx 11 slide; BAO-CAO-slide-bao-ve.docx 12 tieu de/7 hinh; bo-tai-lieu-bao-ve.docx 30 tieu de/10 bang. audit 98.200 phep kiem tra / 0 phat hien; 220 test PASS.
</commit_message>
<xml_diff>
--- a/docs/BAO-CAO.docx
+++ b/docs/BAO-CAO.docx
@@ -25386,7 +25386,7 @@
           </w:tcPr>
           <w:p>
             <w:r>
-              <w:t>docs/BAO-CAO.docx, docs/BAO-CAO-slide.pptx</w:t>
+              <w:t>docs/BAO-CAO.docx, docs/BAO-CAO-slide.pptx, docs/BAO-CAO-slide-bao-ve.pptx, docs/BAO-CAO-slide-bao-ve.docx, docs/bo-tai-lieu-bao-ve.docx</w:t>
             </w:r>
           </w:p>
         </w:tc>
@@ -25396,7 +25396,7 @@
           </w:tcPr>
           <w:p>
             <w:r>
-              <w:t>Bản Word và Slide xuất tự động</w:t>
+              <w:t>Bản Word/Slide xuất tự động: báo cáo hoàn chỉnh, slide tự động, deck bảo vệ (cả .pptx và bản Word để dựng slide), bộ tài liệu bảo vệ</w:t>
             </w:r>
           </w:p>
         </w:tc>

</xml_diff>